<commit_message>
Aplicacion institucional para LEMAS
</commit_message>
<xml_diff>
--- a/docs/Documento_Tecnico_Prediccion_Matricula_v6.docx
+++ b/docs/Documento_Tecnico_Prediccion_Matricula_v6.docx
@@ -21133,7 +21133,7 @@
                 <w:sz w:val="18"/>
                 <w:szCs w:val="18"/>
               </w:rPr>
-              <w:t xml:space="preserve">notebooks/00a–05</w:t>
+              <w:t xml:space="preserve">src/institucional.py</w:t>
             </w:r>
           </w:p>
         </w:tc>
@@ -21164,7 +21164,7 @@
                 <w:sz w:val="18"/>
                 <w:szCs w:val="18"/>
               </w:rPr>
-              <w:t xml:space="preserve">Flujo reproducible en Google Colab</w:t>
+              <w:t xml:space="preserve">Modo institucional: seudonimiza el Excel en memoria y arma la lista con nombres</w:t>
             </w:r>
           </w:p>
         </w:tc>
@@ -21200,7 +21200,74 @@
                 <w:sz w:val="18"/>
                 <w:szCs w:val="18"/>
               </w:rPr>
-              <w:t xml:space="preserve">tests/ (73 pruebas) · GitHub Actions</w:t>
+              <w:t xml:space="preserve">notebooks/00a–05</w:t>
+            </w:r>
+          </w:p>
+        </w:tc>
+        <w:tc>
+          <w:tcPr>
+            <w:tcW w:type="dxa" w:w="6647"/>
+            <w:tcBorders>
+              <w:top w:val="single" w:color="BFBFBF" w:sz="4"/>
+              <w:left w:val="single" w:color="BFBFBF" w:sz="4"/>
+              <w:bottom w:val="single" w:color="BFBFBF" w:sz="4"/>
+              <w:right w:val="single" w:color="BFBFBF" w:sz="4"/>
+            </w:tcBorders>
+            <w:tcMar>
+              <w:top w:type="dxa" w:w="50"/>
+              <w:left w:type="dxa" w:w="90"/>
+              <w:bottom w:type="dxa" w:w="50"/>
+              <w:right w:type="dxa" w:w="90"/>
+            </w:tcMar>
+            <w:vAlign w:val="center"/>
+          </w:tcPr>
+          <w:p>
+            <w:pPr>
+              <w:spacing w:after="0"/>
+            </w:pPr>
+            <w:r>
+              <w:rPr>
+                <w:color w:val="000000"/>
+                <w:sz w:val="18"/>
+                <w:szCs w:val="18"/>
+              </w:rPr>
+              <w:t xml:space="preserve">Flujo reproducible en Google Colab</w:t>
+            </w:r>
+          </w:p>
+        </w:tc>
+      </w:tr>
+      <w:tr>
+        <w:trPr>
+          <w:cantSplit/>
+        </w:trPr>
+        <w:tc>
+          <w:tcPr>
+            <w:tcW w:type="dxa" w:w="2991"/>
+            <w:tcBorders>
+              <w:top w:val="single" w:color="BFBFBF" w:sz="4"/>
+              <w:left w:val="single" w:color="BFBFBF" w:sz="4"/>
+              <w:bottom w:val="single" w:color="BFBFBF" w:sz="4"/>
+              <w:right w:val="single" w:color="BFBFBF" w:sz="4"/>
+            </w:tcBorders>
+            <w:tcMar>
+              <w:top w:type="dxa" w:w="50"/>
+              <w:left w:type="dxa" w:w="90"/>
+              <w:bottom w:type="dxa" w:w="50"/>
+              <w:right w:type="dxa" w:w="90"/>
+            </w:tcMar>
+            <w:vAlign w:val="center"/>
+          </w:tcPr>
+          <w:p>
+            <w:pPr>
+              <w:spacing w:after="0"/>
+            </w:pPr>
+            <w:r>
+              <w:rPr>
+                <w:color w:val="000000"/>
+                <w:sz w:val="18"/>
+                <w:szCs w:val="18"/>
+              </w:rPr>
+              <w:t xml:space="preserve">tests/ (102 pruebas) · GitHub Actions</w:t>
             </w:r>
           </w:p>
         </w:tc>
@@ -21286,7 +21353,36 @@
         <w:t xml:space="preserve">modo institucional</w:t>
       </w:r>
       <w:r>
-        <w:t xml:space="preserve"> que se activa con la variable LEMAS_MODO=institucional y corre en un computador de LEMAS. Ambos rechazan archivos con cédulas, nombres o códigos, procesan en memoria y no guardan datos. Funciones: «Prueba con ejemplo», carga validada de CSV, lista de contactos por sede con k editable, motivo y descarga, proyección frente a B1, formulario individual y sección «Acerca de» con métricas y limitaciones.</w:t>
+        <w:t xml:space="preserve"> que corre en un computador de LEMAS y solo se abre en ese mismo equipo (localhost). Ambos procesan en memoria y no guardan datos, y el modelo recibe siempre la base seudonimizada. Funciones comunes: «Prueba con ejemplo», carga validada de CSV, lista de contactos por sede con k editable, motivo y descarga, proyección frente a B1, formulario individual y sección «Acerca de» con métricas y limitaciones.</w:t>
+      </w:r>
+    </w:p>
+    <w:p>
+      <w:pPr>
+        <w:spacing w:after="120"/>
+        <w:jc w:val="both"/>
+      </w:pPr>
+      <w:r>
+        <w:t xml:space="preserve">Para que el personal de LEMAS no dependa de Colab ni de la línea de comandos, el modo institucional recibe el </w:t>
+      </w:r>
+      <w:r>
+        <w:rPr>
+          <w:b/>
+          <w:bCs/>
+        </w:rPr>
+        <w:t xml:space="preserve">Excel institucional y la clave del custodio</w:t>
+      </w:r>
+      <w:r>
+        <w:t xml:space="preserve">, seudonimiza en memoria con la misma técnica HMAC-SHA256, verifica que no queden nombres ni cédulas y, tras una confirmación explícita, muestra la </w:t>
+      </w:r>
+      <w:r>
+        <w:rPr>
+          <w:b/>
+          <w:bCs/>
+        </w:rPr>
+        <w:t xml:space="preserve">lista con nombres</w:t>
+      </w:r>
+      <w:r>
+        <w:t xml:space="preserve"> para Secretaría. La clave se sube en cada uso y no se guarda; la aplicación muestra su huella para comprobar que es la misma de siempre. Estas funciones no existen en la versión pública (D45).</w:t>
       </w:r>
     </w:p>
     <w:p>
@@ -21578,7 +21674,7 @@
                 <w:sz w:val="18"/>
                 <w:szCs w:val="18"/>
               </w:rPr>
-              <w:t xml:space="preserve">Exportar ciclo actual y anterior; seudonimizar con la misma clave</w:t>
+              <w:t xml:space="preserve">Exportar el Excel institucional (una hoja por ciclo)</w:t>
             </w:r>
           </w:p>
         </w:tc>
@@ -21676,7 +21772,7 @@
                 <w:sz w:val="18"/>
                 <w:szCs w:val="18"/>
               </w:rPr>
-              <w:t xml:space="preserve">Generar la lista por sede en modo institucional</w:t>
+              <w:t xml:space="preserve">Abrir la app institucional, subir el Excel y la clave, y generar la lista por sede</w:t>
             </w:r>
           </w:p>
         </w:tc>
@@ -21707,7 +21803,7 @@
                 <w:sz w:val="18"/>
                 <w:szCs w:val="18"/>
               </w:rPr>
-              <w:t xml:space="preserve">Admisiones</w:t>
+              <w:t xml:space="preserve">Admisiones y custodio</w:t>
             </w:r>
           </w:p>
         </w:tc>
@@ -21774,7 +21870,7 @@
                 <w:sz w:val="18"/>
                 <w:szCs w:val="18"/>
               </w:rPr>
-              <w:t xml:space="preserve">Reidentificar la lista</w:t>
+              <w:t xml:space="preserve">Obtener la lista con nombres y borrar los datos de la sesión</w:t>
             </w:r>
           </w:p>
         </w:tc>
@@ -34550,7 +34646,7 @@
         <w:t xml:space="preserve">Dependencias:</w:t>
       </w:r>
       <w:r>
-        <w:t xml:space="preserve"> H3 depende de la autorización; H5 de H3–H4; H6 de las líneas base; H7 de la selección. Los días 23 y 24 de octubre son contingencia antes de H8. Cada hito se aprueba en la revisión indicada y se registra en el log de decisiones (D01–D44).</w:t>
+        <w:t xml:space="preserve"> H3 depende de la autorización; H5 de H3–H4; H6 de las líneas base; H7 de la selección. Los días 23 y 24 de octubre son contingencia antes de H8. Cada hito se aprueba en la revisión indicada y se registra en el log de decisiones (D01–D45).</w:t>
       </w:r>
     </w:p>
     <w:p>
@@ -36457,7 +36553,7 @@
         <w:t xml:space="preserve">Limitaciones éticas reconocidas:</w:t>
       </w:r>
       <w:r>
-        <w:t xml:space="preserve"> las familias no fueron consultadas (base: interés legítimo institucional con autorización); la equidad no puede afirmarse con pocos eventos por grupo; la regla refleja el pasado y debe revalidarse; no se midió el efecto causal del contacto. El análisis completo está en docs/consideraciones_eticas.md.</w:t>
+        <w:t xml:space="preserve"> las familias no fueron consultadas (base: interés legítimo institucional con autorización); la equidad no puede afirmarse con pocos eventos por grupo; la regla refleja el pasado y debe revalidarse; no se midió el efecto causal del contacto; y la aplicación institucional muestra nombres a personal autorizado, por lo que su protección depende de que LEMAS limite quién usa el equipo y quién tiene la clave. El análisis completo está en docs/consideraciones_eticas.md.</w:t>
       </w:r>
     </w:p>
     <w:p>
@@ -40452,6 +40548,73 @@
                 <w:szCs w:val="18"/>
               </w:rPr>
               <w:t xml:space="preserve">Aplicación en dos modos y despliegue en Streamlit Community Cloud</w:t>
+            </w:r>
+          </w:p>
+        </w:tc>
+      </w:tr>
+      <w:tr>
+        <w:trPr>
+          <w:cantSplit/>
+        </w:trPr>
+        <w:tc>
+          <w:tcPr>
+            <w:tcW w:type="dxa" w:w="1606"/>
+            <w:tcBorders>
+              <w:top w:val="single" w:color="BFBFBF" w:sz="4"/>
+              <w:left w:val="single" w:color="BFBFBF" w:sz="4"/>
+              <w:bottom w:val="single" w:color="BFBFBF" w:sz="4"/>
+              <w:right w:val="single" w:color="BFBFBF" w:sz="4"/>
+            </w:tcBorders>
+            <w:tcMar>
+              <w:top w:type="dxa" w:w="50"/>
+              <w:left w:type="dxa" w:w="90"/>
+              <w:bottom w:type="dxa" w:w="50"/>
+              <w:right w:type="dxa" w:w="90"/>
+            </w:tcMar>
+            <w:vAlign w:val="center"/>
+          </w:tcPr>
+          <w:p>
+            <w:pPr>
+              <w:spacing w:after="0"/>
+            </w:pPr>
+            <w:r>
+              <w:rPr>
+                <w:color w:val="000000"/>
+                <w:sz w:val="18"/>
+                <w:szCs w:val="18"/>
+              </w:rPr>
+              <w:t xml:space="preserve">D45</w:t>
+            </w:r>
+          </w:p>
+        </w:tc>
+        <w:tc>
+          <w:tcPr>
+            <w:tcW w:type="dxa" w:w="8032"/>
+            <w:tcBorders>
+              <w:top w:val="single" w:color="BFBFBF" w:sz="4"/>
+              <w:left w:val="single" w:color="BFBFBF" w:sz="4"/>
+              <w:bottom w:val="single" w:color="BFBFBF" w:sz="4"/>
+              <w:right w:val="single" w:color="BFBFBF" w:sz="4"/>
+            </w:tcBorders>
+            <w:tcMar>
+              <w:top w:type="dxa" w:w="50"/>
+              <w:left w:type="dxa" w:w="90"/>
+              <w:bottom w:type="dxa" w:w="50"/>
+              <w:right w:type="dxa" w:w="90"/>
+            </w:tcMar>
+            <w:vAlign w:val="center"/>
+          </w:tcPr>
+          <w:p>
+            <w:pPr>
+              <w:spacing w:after="0"/>
+            </w:pPr>
+            <w:r>
+              <w:rPr>
+                <w:color w:val="000000"/>
+                <w:sz w:val="18"/>
+                <w:szCs w:val="18"/>
+              </w:rPr>
+              <w:t xml:space="preserve">Modo institucional sin Colab: Excel y clave en el mismo equipo, y lista con nombres</w:t>
             </w:r>
           </w:p>
         </w:tc>

</xml_diff>

<commit_message>
Diagnóstico de sobreajuste y subajuste
</commit_message>
<xml_diff>
--- a/docs/Documento_Tecnico_Prediccion_Matricula_v6.docx
+++ b/docs/Documento_Tecnico_Prediccion_Matricula_v6.docx
@@ -21200,7 +21200,7 @@
                 <w:sz w:val="18"/>
                 <w:szCs w:val="18"/>
               </w:rPr>
-              <w:t xml:space="preserve">notebooks/00a–05</w:t>
+              <w:t xml:space="preserve">src/diagnostico.py</w:t>
             </w:r>
           </w:p>
         </w:tc>
@@ -21231,7 +21231,7 @@
                 <w:sz w:val="18"/>
                 <w:szCs w:val="18"/>
               </w:rPr>
-              <w:t xml:space="preserve">Flujo reproducible en Google Colab</w:t>
+              <w:t xml:space="preserve">Curvas de aprendizaje y diagnóstico de sobreajuste y subajuste (actividad de la semana 3)</w:t>
             </w:r>
           </w:p>
         </w:tc>
@@ -21267,7 +21267,74 @@
                 <w:sz w:val="18"/>
                 <w:szCs w:val="18"/>
               </w:rPr>
-              <w:t xml:space="preserve">tests/ (102 pruebas) · GitHub Actions</w:t>
+              <w:t xml:space="preserve">notebooks/00a–05</w:t>
+            </w:r>
+          </w:p>
+        </w:tc>
+        <w:tc>
+          <w:tcPr>
+            <w:tcW w:type="dxa" w:w="6647"/>
+            <w:tcBorders>
+              <w:top w:val="single" w:color="BFBFBF" w:sz="4"/>
+              <w:left w:val="single" w:color="BFBFBF" w:sz="4"/>
+              <w:bottom w:val="single" w:color="BFBFBF" w:sz="4"/>
+              <w:right w:val="single" w:color="BFBFBF" w:sz="4"/>
+            </w:tcBorders>
+            <w:tcMar>
+              <w:top w:type="dxa" w:w="50"/>
+              <w:left w:type="dxa" w:w="90"/>
+              <w:bottom w:type="dxa" w:w="50"/>
+              <w:right w:type="dxa" w:w="90"/>
+            </w:tcMar>
+            <w:vAlign w:val="center"/>
+          </w:tcPr>
+          <w:p>
+            <w:pPr>
+              <w:spacing w:after="0"/>
+            </w:pPr>
+            <w:r>
+              <w:rPr>
+                <w:color w:val="000000"/>
+                <w:sz w:val="18"/>
+                <w:szCs w:val="18"/>
+              </w:rPr>
+              <w:t xml:space="preserve">Flujo reproducible en Google Colab</w:t>
+            </w:r>
+          </w:p>
+        </w:tc>
+      </w:tr>
+      <w:tr>
+        <w:trPr>
+          <w:cantSplit/>
+        </w:trPr>
+        <w:tc>
+          <w:tcPr>
+            <w:tcW w:type="dxa" w:w="2991"/>
+            <w:tcBorders>
+              <w:top w:val="single" w:color="BFBFBF" w:sz="4"/>
+              <w:left w:val="single" w:color="BFBFBF" w:sz="4"/>
+              <w:bottom w:val="single" w:color="BFBFBF" w:sz="4"/>
+              <w:right w:val="single" w:color="BFBFBF" w:sz="4"/>
+            </w:tcBorders>
+            <w:tcMar>
+              <w:top w:type="dxa" w:w="50"/>
+              <w:left w:type="dxa" w:w="90"/>
+              <w:bottom w:type="dxa" w:w="50"/>
+              <w:right w:type="dxa" w:w="90"/>
+            </w:tcMar>
+            <w:vAlign w:val="center"/>
+          </w:tcPr>
+          <w:p>
+            <w:pPr>
+              <w:spacing w:after="0"/>
+            </w:pPr>
+            <w:r>
+              <w:rPr>
+                <w:color w:val="000000"/>
+                <w:sz w:val="18"/>
+                <w:szCs w:val="18"/>
+              </w:rPr>
+              <w:t xml:space="preserve">tests/ (133 pruebas) · GitHub Actions</w:t>
             </w:r>
           </w:p>
         </w:tc>
@@ -34646,7 +34713,7 @@
         <w:t xml:space="preserve">Dependencias:</w:t>
       </w:r>
       <w:r>
-        <w:t xml:space="preserve"> H3 depende de la autorización; H5 de H3–H4; H6 de las líneas base; H7 de la selección. Los días 23 y 24 de octubre son contingencia antes de H8. Cada hito se aprueba en la revisión indicada y se registra en el log de decisiones (D01–D45).</w:t>
+        <w:t xml:space="preserve"> H3 depende de la autorización; H5 de H3–H4; H6 de las líneas base; H7 de la selección. Los días 23 y 24 de octubre son contingencia antes de H8. Cada hito se aprueba en la revisión indicada y se registra en el log de decisiones (D01–D46).</w:t>
       </w:r>
     </w:p>
     <w:p>

</xml_diff>

<commit_message>
Diagnóstico de sobreajuste y subajuste con datos reales
</commit_message>
<xml_diff>
--- a/docs/Documento_Tecnico_Prediccion_Matricula_v6.docx
+++ b/docs/Documento_Tecnico_Prediccion_Matricula_v6.docx
@@ -17634,7 +17634,7 @@
                 <w:sz w:val="18"/>
                 <w:szCs w:val="18"/>
               </w:rPr>
-              <w:t xml:space="preserve">0,104</w:t>
+              <w:t xml:space="preserve">0,103</w:t>
             </w:r>
           </w:p>
         </w:tc>
@@ -18798,7 +18798,7 @@
         <w:t xml:space="preserve">Errores de los modelos.</w:t>
       </w:r>
       <w:r>
-        <w:t xml:space="preserve"> El gradient boosting duplicó su PR-AUC en entrenamiento (0,245) sin mejorar en C4 (0,104): aprendió particularidades de C2–C3 que no se repitieron. La logística híbrida, con pocas variables, no distinguió el riesgo individual más allá de la tasa histórica en C5 (Lift 0,98; Brier igual a B1).</w:t>
+        <w:t xml:space="preserve"> El gradient boosting duplicó su PR-AUC en entrenamiento (0,245) sin mejorar en C4 (0,103): aprendió particularidades de C2–C3 que no se repitieron. La logística híbrida, con pocas variables, no distinguió el riesgo individual más allá de la tasa histórica en C5 (Lift 0,98; Brier igual a B1).</w:t>
       </w:r>
     </w:p>
     <w:p>
@@ -21334,7 +21334,7 @@
                 <w:sz w:val="18"/>
                 <w:szCs w:val="18"/>
               </w:rPr>
-              <w:t xml:space="preserve">tests/ (133 pruebas) · GitHub Actions</w:t>
+              <w:t xml:space="preserve">tests/ (135 pruebas) · GitHub Actions</w:t>
             </w:r>
           </w:p>
         </w:tc>

</xml_diff>

<commit_message>
D54: revisión del diagnóstico semana 3 (límite de señal, estrategias de un solo cambio, bootstrap/réplica/semillas, pérdida en escala común) y resultados reales
</commit_message>
<xml_diff>
--- a/docs/Documento_Tecnico_Prediccion_Matricula_v6.docx
+++ b/docs/Documento_Tecnico_Prediccion_Matricula_v6.docx
@@ -17299,7 +17299,7 @@
                 <w:sz w:val="18"/>
                 <w:szCs w:val="18"/>
               </w:rPr>
-              <w:t xml:space="preserve">Sin brecha, pero subajuste (1,41 veces el azar)</w:t>
+              <w:t xml:space="preserve">Límite de señal: sin brecha, 1,41 veces el azar</w:t>
             </w:r>
           </w:p>
         </w:tc>
@@ -17490,7 +17490,7 @@
                 <w:sz w:val="18"/>
                 <w:szCs w:val="18"/>
               </w:rPr>
-              <w:t xml:space="preserve">Subajuste (1,28 veces el azar)</w:t>
+              <w:t xml:space="preserve">Límite de señal: 1,28 veces el azar</w:t>
             </w:r>
           </w:p>
         </w:tc>
@@ -17731,10 +17731,39 @@
           <w:b/>
           <w:bCs/>
         </w:rPr>
-        <w:t xml:space="preserve">Diagnóstico de ajuste (semana 3).</w:t>
-      </w:r>
-      <w:r>
-        <w:t xml:space="preserve"> Con curvas de aprendizaje y dos reglas fijadas antes de ejecutar (sobreajuste si la PR-AUC pierde más del 30 % entre entrenamiento y C4; subajuste si, sin esa brecha, no llega a 1,5 veces el azar), el gradient boosting sobreajusta y las dos regresiones logísticas subajustan. Probamos seis estrategias con comparación antes y después: ninguna cambió el diagnóstico de su modelo y solo la ingeniería de variables mejoró la validación (PR-AUC de 0,113 a 0,125; Lift@k de 1,40 a 1,53). El detalle está en docs/diagnostic_report.pdf y en el cuaderno overfitting_analysis.</w:t>
+        <w:t xml:space="preserve">Diagnóstico de ajuste (semana 3, revisado en D54).</w:t>
+      </w:r>
+      <w:r>
+        <w:t xml:space="preserve"> Con curvas de aprendizaje y dos reglas (sobreajuste si la PR-AUC pierde más del 30 % entre entrenamiento y C4; subajuste si, sin esa brecha, no llega a 1,5 veces el azar), el gradient boosting sobreajusta. Las dos regresiones logísticas quedan por debajo de 1,5 veces el azar, pero una segunda etapa muestra que no son rígidas: con más capacidad (C hasta 100) su validación no cambia (0,000) y más datos tampoco ayudan de forma concluyente. Por eso las nombramos </w:t>
+      </w:r>
+      <w:r>
+        <w:rPr>
+          <w:b/>
+          <w:bCs/>
+        </w:rPr>
+        <w:t xml:space="preserve">límite de señal</w:t>
+      </w:r>
+      <w:r>
+        <w:t xml:space="preserve">, y reservamos «subajuste (falta capacidad)» para el control sobrerregularizado, que sí mejora (+0,016).</w:t>
+      </w:r>
+    </w:p>
+    <w:p>
+      <w:pPr>
+        <w:spacing w:after="120"/>
+        <w:jc w:val="both"/>
+      </w:pPr>
+      <w:r>
+        <w:t xml:space="preserve">Probamos siete estrategias que cambian una sola cosa cada una, con un intervalo bootstrap por familias, una réplica en C2 → C3 y cinco semillas, y una regla de veredicto fijada antes de repetir el análisis con datos reales. </w:t>
+      </w:r>
+      <w:r>
+        <w:rPr>
+          <w:b/>
+          <w:bCs/>
+        </w:rPr>
+        <w:t xml:space="preserve">Ninguna mejora ni empeora la PR-AUC en C4 de forma demostrable.</w:t>
+      </w:r>
+      <w:r>
+        <w:t xml:space="preserve"> Separar variables (E4a: 0,113 → 0,120) e hiperparámetros (E4b: 0,120 → 0,125) mostró que ninguno de los dos pasos es concluyente por sí solo, y dar más capacidad a la híbrida con interacciones solo la hizo memorizar (entrenamiento 0,126 → 0,227; C4 0,127). El detalle está en docs/diagnostic_report.pdf y en el cuaderno overfitting_analysis.</w:t>
       </w:r>
     </w:p>
     <w:p>
@@ -34961,7 +34990,7 @@
         <w:t xml:space="preserve">Dependencias:</w:t>
       </w:r>
       <w:r>
-        <w:t xml:space="preserve"> H3 depende de la autorización; H5 de H3–H4; H6 de las líneas base; H7 de la selección. Los días 23 y 24 de octubre son contingencia antes de H8. Cada hito se aprueba en la revisión indicada y se registra en el log de decisiones (D01–D53).</w:t>
+        <w:t xml:space="preserve"> H3 depende de la autorización; H5 de H3–H4; H6 de las líneas base; H7 de la selección. Los días 23 y 24 de octubre son contingencia antes de H8. Cada hito se aprueba en la revisión indicada y se registra en el log de decisiones (D01–D54).</w:t>
       </w:r>
     </w:p>
     <w:p>
@@ -37227,7 +37256,7 @@
                 <w:sz w:val="18"/>
                 <w:szCs w:val="18"/>
               </w:rPr>
-              <w:t xml:space="preserve">Decisiones D01–D53, código, pruebas y sistema congelado</w:t>
+              <w:t xml:space="preserve">Decisiones D01–D54, código, pruebas y sistema congelado</w:t>
             </w:r>
           </w:p>
         </w:tc>
@@ -37621,7 +37650,7 @@
         <w:spacing w:after="60"/>
       </w:pPr>
       <w:r>
-        <w:t xml:space="preserve">Los modelos de aprendizaje automático no superaron a la regla con ~200 eventos: el diagnóstico de ajuste mostró sobreajuste en árboles y subajuste en lineales. Reportarlo con honestidad es parte del aporte.</w:t>
+        <w:t xml:space="preserve">Los modelos de aprendizaje automático no superaron a la regla con ~200 eventos: el diagnóstico de ajuste mostró sobreajuste en árboles y un límite de señal en los modelos lineales. Reportarlo con honestidad es parte del aporte.</w:t>
       </w:r>
     </w:p>
     <w:p>
@@ -42268,6 +42297,73 @@
                 <w:szCs w:val="18"/>
               </w:rPr>
               <w:t xml:space="preserve">La proyección se publica por subnivel y por sede, sin su cruce, para que no se deduzcan conteos menores que 5</w:t>
+            </w:r>
+          </w:p>
+        </w:tc>
+      </w:tr>
+      <w:tr>
+        <w:trPr>
+          <w:cantSplit/>
+        </w:trPr>
+        <w:tc>
+          <w:tcPr>
+            <w:tcW w:type="dxa" w:w="1606"/>
+            <w:tcBorders>
+              <w:top w:val="single" w:color="BFBFBF" w:sz="4"/>
+              <w:left w:val="single" w:color="BFBFBF" w:sz="4"/>
+              <w:bottom w:val="single" w:color="BFBFBF" w:sz="4"/>
+              <w:right w:val="single" w:color="BFBFBF" w:sz="4"/>
+            </w:tcBorders>
+            <w:tcMar>
+              <w:top w:type="dxa" w:w="50"/>
+              <w:left w:type="dxa" w:w="90"/>
+              <w:bottom w:type="dxa" w:w="50"/>
+              <w:right w:type="dxa" w:w="90"/>
+            </w:tcMar>
+            <w:vAlign w:val="center"/>
+          </w:tcPr>
+          <w:p>
+            <w:pPr>
+              <w:spacing w:after="0"/>
+            </w:pPr>
+            <w:r>
+              <w:rPr>
+                <w:color w:val="000000"/>
+                <w:sz w:val="18"/>
+                <w:szCs w:val="18"/>
+              </w:rPr>
+              <w:t xml:space="preserve">D54</w:t>
+            </w:r>
+          </w:p>
+        </w:tc>
+        <w:tc>
+          <w:tcPr>
+            <w:tcW w:type="dxa" w:w="8032"/>
+            <w:tcBorders>
+              <w:top w:val="single" w:color="BFBFBF" w:sz="4"/>
+              <w:left w:val="single" w:color="BFBFBF" w:sz="4"/>
+              <w:bottom w:val="single" w:color="BFBFBF" w:sz="4"/>
+              <w:right w:val="single" w:color="BFBFBF" w:sz="4"/>
+            </w:tcBorders>
+            <w:tcMar>
+              <w:top w:type="dxa" w:w="50"/>
+              <w:left w:type="dxa" w:w="90"/>
+              <w:bottom w:type="dxa" w:w="50"/>
+              <w:right w:type="dxa" w:w="90"/>
+            </w:tcMar>
+            <w:vAlign w:val="center"/>
+          </w:tcPr>
+          <w:p>
+            <w:pPr>
+              <w:spacing w:after="0"/>
+            </w:pPr>
+            <w:r>
+              <w:rPr>
+                <w:color w:val="000000"/>
+                <w:sz w:val="18"/>
+                <w:szCs w:val="18"/>
+              </w:rPr>
+              <w:t xml:space="preserve">Revisión del diagnóstico de la semana 3: límite de señal frente a falta de capacidad, estrategias de un solo cambio y veredicto con bootstrap, réplica y semillas</w:t>
             </w:r>
           </w:p>
         </w:tc>

</xml_diff>

<commit_message>
D59: resultados reales del cuaderno 08 y aclaración en el documento técnico v6
</commit_message>
<xml_diff>
--- a/docs/Documento_Tecnico_Prediccion_Matricula_v6.docx
+++ b/docs/Documento_Tecnico_Prediccion_Matricula_v6.docx
@@ -491,15 +491,7 @@
                 <w:sz w:val="18"/>
                 <w:szCs w:val="18"/>
               </w:rPr>
-              <w:t xml:space="preserve">1,97</w:t>
-            </w:r>
-            <w:r>
-              <w:rPr>
-                <w:color w:val="000000"/>
-                <w:sz w:val="18"/>
-                <w:szCs w:val="18"/>
-              </w:rPr>
-              <w:t xml:space="preserve"> [IC 95 %: 1,24 – 2,56]</w:t>
+              <w:t xml:space="preserve">1,97 [IC 95 %: 1,24 – 2,56]</w:t>
             </w:r>
           </w:p>
         </w:tc>
@@ -977,6 +969,42 @@
       </w:r>
       <w:r>
         <w:t xml:space="preserve"> la regla y para medir su incertidumbre.</w:t>
+      </w:r>
+    </w:p>
+    <w:p>
+      <w:pPr>
+        <w:spacing w:after="120"/>
+        <w:jc w:val="both"/>
+      </w:pPr>
+      <w:r>
+        <w:rPr>
+          <w:b/>
+          <w:bCs/>
+        </w:rPr>
+        <w:t xml:space="preserve">Aclaración sobre el origen de D2 (revisión final, D59).</w:t>
+      </w:r>
+      <w:r>
+        <w:t xml:space="preserve"> El orden de las señales de D2 se tomó del análisis exploratorio, que calculó las tasas de no matrícula con las cinco cohortes, incluidas C4 (selección) y C5 (prueba). Ningún parámetro se estimó con esas cohortes y nada se cambió después de ver C5, pero el diseño de la regla sí vio sus tasas de forma agregada: la prueba en C5 es </w:t>
+      </w:r>
+      <w:r>
+        <w:rPr>
+          <w:b/>
+          <w:bCs/>
+        </w:rPr>
+        <w:t xml:space="preserve">fuera de ajuste, no fuera de diseño</w:t>
+      </w:r>
+      <w:r>
+        <w:t xml:space="preserve">. Para comprobar si eso cambió algo, se repitió el cálculo solo con las cohortes anteriores a la selección (cuaderno 08). Con C1–C3, el riesgo relativo del pago tardío de la matrícula anterior es 2,88; el de la reserva extraordinaria, 1,47, y el de al menos una pensión pagada tarde, 1,27: </w:t>
+      </w:r>
+      <w:r>
+        <w:rPr>
+          <w:b/>
+          <w:bCs/>
+        </w:rPr>
+        <w:t xml:space="preserve">el mismo orden de D2</w:t>
+      </w:r>
+      <w:r>
+        <w:t xml:space="preserve">. Con C2–C3, las cohortes de entrenamiento, también (2,95; 1,50 y 1,32). Por cohorte separada, el orden de las dos últimas señales se invierte en C1 y C2, porque su diferencia es pequeña; el pago tardío es la señal más fuerte en todas las cohortes con casos suficientes. D2 se habría construido igual sin mirar C4 ni C5.</w:t>
       </w:r>
     </w:p>
     <w:p>
@@ -8813,15 +8841,7 @@
                 <w:sz w:val="18"/>
                 <w:szCs w:val="18"/>
               </w:rPr>
-              <w:t xml:space="preserve">Obligatorias; </w:t>
-            </w:r>
-            <w:r>
-              <w:rPr>
-                <w:color w:val="000000"/>
-                <w:sz w:val="18"/>
-                <w:szCs w:val="18"/>
-              </w:rPr>
-              <w:t xml:space="preserve">D2 resultó la mejor</w:t>
+              <w:t xml:space="preserve">Obligatorias; D2 resultó la mejor</w:t>
             </w:r>
           </w:p>
         </w:tc>
@@ -17784,6 +17804,32 @@
     </w:p>
     <w:p>
       <w:pPr>
+        <w:spacing w:after="120"/>
+        <w:jc w:val="both"/>
+      </w:pPr>
+      <w:r>
+        <w:rPr>
+          <w:b/>
+          <w:bCs/>
+        </w:rPr>
+        <w:t xml:space="preserve">Actualización con 500 sorteos y comparación con D (D59).</w:t>
+      </w:r>
+      <w:r>
+        <w:t xml:space="preserve"> Con 500 sorteos, el Lift@k de D2 en C4 tiene una media de 1,77 (percentiles 5 y 95: 1,60 y 1,93; extremos: 1,40 y 2,06); el 1,93 de la semilla oficial supera al 87 % de los sorteos. Un bootstrap pareado, con las dos reglas sobre las mismas remuestras de familias y un sorteo nuevo en cada una, da una diferencia D2 − D de 0,00 [IC 95 %: −0,62; 0,62]: </w:t>
+      </w:r>
+      <w:r>
+        <w:rPr>
+          <w:b/>
+          <w:bCs/>
+        </w:rPr>
+        <w:t xml:space="preserve">en C4 no se puede afirmar que D2 sea mejor que la regla D</w:t>
+      </w:r>
+      <w:r>
+        <w:t xml:space="preserve">, aunque en promedio las dos quedan por encima de la logística híbrida (1,53). D2 se mantiene por la regla de decisión registrada de antemano y porque explica mejor a Secretaría por qué se llama a cada familia. Por último, la referencia del azar (1,08 en C5 y 1,12 en C4) supera a 1 porque el sorteo es por estudiante y las familias con caso tienen más hijos en promedio (1,45 frente a 1,30); con un sorteo uniforme por familia da 1,00.</w:t>
+      </w:r>
+    </w:p>
+    <w:p>
+      <w:pPr>
         <w:spacing w:after="60" w:before="120"/>
         <w:jc w:val="center"/>
       </w:pPr>
@@ -37727,14 +37773,7 @@
           <w:sz w:val="19"/>
           <w:szCs w:val="19"/>
         </w:rPr>
-        <w:t xml:space="preserve">[1]	</w:t>
-      </w:r>
-      <w:r>
-        <w:rPr>
-          <w:sz w:val="19"/>
-          <w:szCs w:val="19"/>
-        </w:rPr>
-        <w:t xml:space="preserve">J. G. C. Krüger, A. S. Britto y J. P. Barddal, “An explainable machine learning approach for student dropout prediction,” Expert Systems with Applications, vol. 233, 2023, doi: 10.1016/j.eswa.2023.120933.</w:t>
+        <w:t xml:space="preserve">[1]	J. G. C. Krüger, A. S. Britto y J. P. Barddal, “An explainable machine learning approach for student dropout prediction,” Expert Systems with Applications, vol. 233, 2023, doi: 10.1016/j.eswa.2023.120933.</w:t>
       </w:r>
     </w:p>
     <w:p>
@@ -37747,14 +37786,7 @@
           <w:sz w:val="19"/>
           <w:szCs w:val="19"/>
         </w:rPr>
-        <w:t xml:space="preserve">[2]	</w:t>
-      </w:r>
-      <w:r>
-        <w:rPr>
-          <w:sz w:val="19"/>
-          <w:szCs w:val="19"/>
-        </w:rPr>
-        <w:t xml:space="preserve">M. Nagy y R. Molontay, “Interpretable dropout prediction: Towards XAI-based personalized intervention,” Int. J. Artif. Intell. Educ., vol. 34, no. 2, pp. 274–300, 2024, doi: 10.1007/s40593-023-00331-8.</w:t>
+        <w:t xml:space="preserve">[2]	M. Nagy y R. Molontay, “Interpretable dropout prediction: Towards XAI-based personalized intervention,” Int. J. Artif. Intell. Educ., vol. 34, no. 2, pp. 274–300, 2024, doi: 10.1007/s40593-023-00331-8.</w:t>
       </w:r>
     </w:p>
     <w:p>
@@ -37767,14 +37799,7 @@
           <w:sz w:val="19"/>
           <w:szCs w:val="19"/>
         </w:rPr>
-        <w:t xml:space="preserve">[3]	</w:t>
-      </w:r>
-      <w:r>
-        <w:rPr>
-          <w:sz w:val="19"/>
-          <w:szCs w:val="19"/>
-        </w:rPr>
-        <w:t xml:space="preserve">V. Realinho, J. Machado, L. Baptista y M. V. Martins, “Predicting student dropout and academic success,” Data, vol. 7, no. 11, art. 146, 2022, doi: 10.3390/data7110146.</w:t>
+        <w:t xml:space="preserve">[3]	V. Realinho, J. Machado, L. Baptista y M. V. Martins, “Predicting student dropout and academic success,” Data, vol. 7, no. 11, art. 146, 2022, doi: 10.3390/data7110146.</w:t>
       </w:r>
     </w:p>
     <w:p>
@@ -37787,14 +37812,7 @@
           <w:sz w:val="19"/>
           <w:szCs w:val="19"/>
         </w:rPr>
-        <w:t xml:space="preserve">[4]	</w:t>
-      </w:r>
-      <w:r>
-        <w:rPr>
-          <w:sz w:val="19"/>
-          <w:szCs w:val="19"/>
-        </w:rPr>
-        <w:t xml:space="preserve">S. Matz et al., “Using machine learning to predict student retention from socio-demographic characteristics and app-based engagement metrics,” Scientific Reports, vol. 13, 2023, doi: 10.1038/s41598-023-32484-w.</w:t>
+        <w:t xml:space="preserve">[4]	S. Matz et al., “Using machine learning to predict student retention from socio-demographic characteristics and app-based engagement metrics,” Scientific Reports, vol. 13, 2023, doi: 10.1038/s41598-023-32484-w.</w:t>
       </w:r>
     </w:p>
     <w:p>
@@ -37807,14 +37825,7 @@
           <w:sz w:val="19"/>
           <w:szCs w:val="19"/>
         </w:rPr>
-        <w:t xml:space="preserve">[5]	</w:t>
-      </w:r>
-      <w:r>
-        <w:rPr>
-          <w:sz w:val="19"/>
-          <w:szCs w:val="19"/>
-        </w:rPr>
-        <w:t xml:space="preserve">C. A. Palacios et al., “Knowledge discovery for higher education student retention based on data mining: Machine learning algorithms and case study in Chile,” Entropy, vol. 23, no. 4, art. 485, 2021, doi: 10.3390/e23040485.</w:t>
+        <w:t xml:space="preserve">[5]	C. A. Palacios et al., “Knowledge discovery for higher education student retention based on data mining: Machine learning algorithms and case study in Chile,” Entropy, vol. 23, no. 4, art. 485, 2021, doi: 10.3390/e23040485.</w:t>
       </w:r>
     </w:p>
     <w:p>
@@ -37827,14 +37838,7 @@
           <w:sz w:val="19"/>
           <w:szCs w:val="19"/>
         </w:rPr>
-        <w:t xml:space="preserve">[6]	</w:t>
-      </w:r>
-      <w:r>
-        <w:rPr>
-          <w:sz w:val="19"/>
-          <w:szCs w:val="19"/>
-        </w:rPr>
-        <w:t xml:space="preserve">J. Niyogisubizo et al., “Predicting student's dropout in university classes using two-layer ensemble machine learning approach,” Computers and Education: Artificial Intelligence, vol. 3, art. 100066, 2022, doi: 10.1016/j.caeai.2022.100066.</w:t>
+        <w:t xml:space="preserve">[6]	J. Niyogisubizo et al., “Predicting student's dropout in university classes using two-layer ensemble machine learning approach,” Computers and Education: Artificial Intelligence, vol. 3, art. 100066, 2022, doi: 10.1016/j.caeai.2022.100066.</w:t>
       </w:r>
     </w:p>
     <w:p>
@@ -37847,14 +37851,7 @@
           <w:sz w:val="19"/>
           <w:szCs w:val="19"/>
         </w:rPr>
-        <w:t xml:space="preserve">[7]	</w:t>
-      </w:r>
-      <w:r>
-        <w:rPr>
-          <w:sz w:val="19"/>
-          <w:szCs w:val="19"/>
-        </w:rPr>
-        <w:t xml:space="preserve">K. Oqaidi, S. Aouhassi y K. Mansouri, “Towards a students’ dropout prediction model in higher education institutions using machine learning algorithms,” Int. J. Emerg. Technol. Learn., vol. 17, no. 18, 2022, doi: 10.3991/ijet.v17i18.25567.</w:t>
+        <w:t xml:space="preserve">[7]	K. Oqaidi, S. Aouhassi y K. Mansouri, “Towards a students’ dropout prediction model in higher education institutions using machine learning algorithms,” Int. J. Emerg. Technol. Learn., vol. 17, no. 18, 2022, doi: 10.3991/ijet.v17i18.25567.</w:t>
       </w:r>
     </w:p>
     <w:p>
@@ -37867,14 +37864,7 @@
           <w:sz w:val="19"/>
           <w:szCs w:val="19"/>
         </w:rPr>
-        <w:t xml:space="preserve">[8]	</w:t>
-      </w:r>
-      <w:r>
-        <w:rPr>
-          <w:sz w:val="19"/>
-          <w:szCs w:val="19"/>
-        </w:rPr>
-        <w:t xml:space="preserve">J. Kabathova y M. Drlík, “Towards predicting student’s dropout in university courses using different machine learning techniques,” Applied Sciences, vol. 11, no. 7, art. 3130, 2021, doi: 10.3390/app11073130.</w:t>
+        <w:t xml:space="preserve">[8]	J. Kabathova y M. Drlík, “Towards predicting student’s dropout in university courses using different machine learning techniques,” Applied Sciences, vol. 11, no. 7, art. 3130, 2021, doi: 10.3390/app11073130.</w:t>
       </w:r>
     </w:p>
     <w:p>
@@ -37887,14 +37877,7 @@
           <w:sz w:val="19"/>
           <w:szCs w:val="19"/>
         </w:rPr>
-        <w:t xml:space="preserve">[9]	</w:t>
-      </w:r>
-      <w:r>
-        <w:rPr>
-          <w:sz w:val="19"/>
-          <w:szCs w:val="19"/>
-        </w:rPr>
-        <w:t xml:space="preserve">S. H. Kim, E.-T. Choi, Y.-K. Jun y S. Lee, “Student dropout prediction for university with high precision and recall,” Applied Sciences, vol. 13, art. 6275, 2023, doi: 10.3390/app13106275.</w:t>
+        <w:t xml:space="preserve">[9]	S. H. Kim, E.-T. Choi, Y.-K. Jun y S. Lee, “Student dropout prediction for university with high precision and recall,” Applied Sciences, vol. 13, art. 6275, 2023, doi: 10.3390/app13106275.</w:t>
       </w:r>
     </w:p>
     <w:p>
@@ -37907,14 +37890,7 @@
           <w:sz w:val="19"/>
           <w:szCs w:val="19"/>
         </w:rPr>
-        <w:t xml:space="preserve">[10]	</w:t>
-      </w:r>
-      <w:r>
-        <w:rPr>
-          <w:sz w:val="19"/>
-          <w:szCs w:val="19"/>
-        </w:rPr>
-        <w:t xml:space="preserve">Z. Song, S.-H. Sung, D.-M. Park y B.-K. Park, “All-year dropout prediction modeling and analysis for university students,” Applied Sciences, vol. 13, art. 1143, 2023, doi: 10.3390/app13021143.</w:t>
+        <w:t xml:space="preserve">[10]	Z. Song, S.-H. Sung, D.-M. Park y B.-K. Park, “All-year dropout prediction modeling and analysis for university students,” Applied Sciences, vol. 13, art. 1143, 2023, doi: 10.3390/app13021143.</w:t>
       </w:r>
     </w:p>
     <w:p>
@@ -37927,14 +37903,7 @@
           <w:sz w:val="19"/>
           <w:szCs w:val="19"/>
         </w:rPr>
-        <w:t xml:space="preserve">[11]	</w:t>
-      </w:r>
-      <w:r>
-        <w:rPr>
-          <w:sz w:val="19"/>
-          <w:szCs w:val="19"/>
-        </w:rPr>
-        <w:t xml:space="preserve">M. Vaarma y H. Li, “Predicting student dropouts with machine learning,” Technology in Society, vol. 76, art. 102474, 2024, doi: 10.1016/j.techsoc.2024.102474.</w:t>
+        <w:t xml:space="preserve">[11]	M. Vaarma y H. Li, “Predicting student dropouts with machine learning,” Technology in Society, vol. 76, art. 102474, 2024, doi: 10.1016/j.techsoc.2024.102474.</w:t>
       </w:r>
     </w:p>
     <w:p>
@@ -37947,14 +37916,7 @@
           <w:sz w:val="19"/>
           <w:szCs w:val="19"/>
         </w:rPr>
-        <w:t xml:space="preserve">[12]	</w:t>
-      </w:r>
-      <w:r>
-        <w:rPr>
-          <w:sz w:val="19"/>
-          <w:szCs w:val="19"/>
-        </w:rPr>
-        <w:t xml:space="preserve">A. Villar y C. R. V. de Andrade, “Supervised machine learning algorithms for predicting student dropout and academic success: A comparative study,” Discover Artificial Intelligence, vol. 4, art. 2, 2024, doi: 10.1007/s44163-023-00079-z.</w:t>
+        <w:t xml:space="preserve">[12]	A. Villar y C. R. V. de Andrade, “Supervised machine learning algorithms for predicting student dropout and academic success: A comparative study,” Discover Artificial Intelligence, vol. 4, art. 2, 2024, doi: 10.1007/s44163-023-00079-z.</w:t>
       </w:r>
     </w:p>
     <w:p>
@@ -37967,14 +37929,7 @@
           <w:sz w:val="19"/>
           <w:szCs w:val="19"/>
         </w:rPr>
-        <w:t xml:space="preserve">[13]	</w:t>
-      </w:r>
-      <w:r>
-        <w:rPr>
-          <w:sz w:val="19"/>
-          <w:szCs w:val="19"/>
-        </w:rPr>
-        <w:t xml:space="preserve">M. Psyridou et al., “Machine learning predicts upper secondary education dropout as early as the end of primary school,” Scientific Reports, vol. 14, 2024, doi: 10.1038/s41598-024-63629-0.</w:t>
+        <w:t xml:space="preserve">[13]	M. Psyridou et al., “Machine learning predicts upper secondary education dropout as early as the end of primary school,” Scientific Reports, vol. 14, 2024, doi: 10.1038/s41598-024-63629-0.</w:t>
       </w:r>
     </w:p>
     <w:p>
@@ -37987,14 +37942,7 @@
           <w:sz w:val="19"/>
           <w:szCs w:val="19"/>
         </w:rPr>
-        <w:t xml:space="preserve">[14]	</w:t>
-      </w:r>
-      <w:r>
-        <w:rPr>
-          <w:sz w:val="19"/>
-          <w:szCs w:val="19"/>
-        </w:rPr>
-        <w:t xml:space="preserve">M. R. Marcolino et al., “Student dropout prediction through machine learning optimization: Insights from Moodle log data,” Scientific Reports, 2025, doi: 10.1038/s41598-025-93918-1.</w:t>
+        <w:t xml:space="preserve">[14]	M. R. Marcolino et al., “Student dropout prediction through machine learning optimization: Insights from Moodle log data,” Scientific Reports, 2025, doi: 10.1038/s41598-025-93918-1.</w:t>
       </w:r>
     </w:p>
     <w:p>
@@ -38007,14 +37955,7 @@
           <w:sz w:val="19"/>
           <w:szCs w:val="19"/>
         </w:rPr>
-        <w:t xml:space="preserve">[15]	</w:t>
-      </w:r>
-      <w:r>
-        <w:rPr>
-          <w:sz w:val="19"/>
-          <w:szCs w:val="19"/>
-        </w:rPr>
-        <w:t xml:space="preserve">B. Carballo Mendívil et al., “Predicting student dropout from day one: XGBoost-based early warning system using pre-enrollment data,” Applied Sciences, vol. 15, art. 9202, 2025, doi: 10.3390/app15169202.</w:t>
+        <w:t xml:space="preserve">[15]	B. Carballo Mendívil et al., “Predicting student dropout from day one: XGBoost-based early warning system using pre-enrollment data,” Applied Sciences, vol. 15, art. 9202, 2025, doi: 10.3390/app15169202.</w:t>
       </w:r>
     </w:p>
     <w:p>
@@ -38027,14 +37968,7 @@
           <w:sz w:val="19"/>
           <w:szCs w:val="19"/>
         </w:rPr>
-        <w:t xml:space="preserve">[16]	</w:t>
-      </w:r>
-      <w:r>
-        <w:rPr>
-          <w:sz w:val="19"/>
-          <w:szCs w:val="19"/>
-        </w:rPr>
-        <w:t xml:space="preserve">A. Bettahi, F.-Z. Belouadha y H. Harroud, “A modular and explainable machine learning pipeline for student dropout prediction in higher education,” Algorithms, vol. 18, art. 662, 2025, doi: 10.3390/a18100662.</w:t>
+        <w:t xml:space="preserve">[16]	A. Bettahi, F.-Z. Belouadha y H. Harroud, “A modular and explainable machine learning pipeline for student dropout prediction in higher education,” Algorithms, vol. 18, art. 662, 2025, doi: 10.3390/a18100662.</w:t>
       </w:r>
     </w:p>
     <w:p>
@@ -38047,14 +37981,7 @@
           <w:sz w:val="19"/>
           <w:szCs w:val="19"/>
         </w:rPr>
-        <w:t xml:space="preserve">[17]	</w:t>
-      </w:r>
-      <w:r>
-        <w:rPr>
-          <w:sz w:val="19"/>
-          <w:szCs w:val="19"/>
-        </w:rPr>
-        <w:t xml:space="preserve">J. Cheng et al., “Predicting student dropout risk with a dual-modal abrupt behavioral changes approach,” arXiv:2505.11119, 2025.</w:t>
+        <w:t xml:space="preserve">[17]	J. Cheng et al., “Predicting student dropout risk with a dual-modal abrupt behavioral changes approach,” arXiv:2505.11119, 2025.</w:t>
       </w:r>
     </w:p>
     <w:p>
@@ -38067,14 +37994,7 @@
           <w:sz w:val="19"/>
           <w:szCs w:val="19"/>
         </w:rPr>
-        <w:t xml:space="preserve">[18]	</w:t>
-      </w:r>
-      <w:r>
-        <w:rPr>
-          <w:sz w:val="19"/>
-          <w:szCs w:val="19"/>
-        </w:rPr>
-        <w:t xml:space="preserve">J. Fields et al., “A privacy-preserving framework using remote data science for inter-institutional student retention prediction,” arXiv:2606.12845, 2026.</w:t>
+        <w:t xml:space="preserve">[18]	J. Fields et al., “A privacy-preserving framework using remote data science for inter-institutional student retention prediction,” arXiv:2606.12845, 2026.</w:t>
       </w:r>
     </w:p>
     <w:p>
@@ -38087,14 +38007,7 @@
           <w:sz w:val="19"/>
           <w:szCs w:val="19"/>
         </w:rPr>
-        <w:t xml:space="preserve">[19]	</w:t>
-      </w:r>
-      <w:r>
-        <w:rPr>
-          <w:sz w:val="19"/>
-          <w:szCs w:val="19"/>
-        </w:rPr>
-        <w:t xml:space="preserve">I. K. Nti y S. Ramanayake, “Explainable machine learning for student dropout prediction and tailored interventions in online personalized education,” Discover Artificial Intelligence, vol. 6, art. 288, 2026, doi: 10.1007/s44163-026-01016-6.</w:t>
+        <w:t xml:space="preserve">[19]	I. K. Nti y S. Ramanayake, “Explainable machine learning for student dropout prediction and tailored interventions in online personalized education,” Discover Artificial Intelligence, vol. 6, art. 288, 2026, doi: 10.1007/s44163-026-01016-6.</w:t>
       </w:r>
     </w:p>
     <w:p>
@@ -38107,14 +38020,7 @@
           <w:sz w:val="19"/>
           <w:szCs w:val="19"/>
         </w:rPr>
-        <w:t xml:space="preserve">[20]	</w:t>
-      </w:r>
-      <w:r>
-        <w:rPr>
-          <w:sz w:val="19"/>
-          <w:szCs w:val="19"/>
-        </w:rPr>
-        <w:t xml:space="preserve">G. L. López-Muñoz, C. González Serrano y C. Sánchez-Ferreira, “Student dropout prediction in higher education: A systematic review of machine learning methods and risk factors,” J. Inf. Technol. Educ.: Research, vol. 25, art. 20, 2026, doi: 10.28945/5776.</w:t>
+        <w:t xml:space="preserve">[20]	G. L. López-Muñoz, C. González Serrano y C. Sánchez-Ferreira, “Student dropout prediction in higher education: A systematic review of machine learning methods and risk factors,” J. Inf. Technol. Educ.: Research, vol. 25, art. 20, 2026, doi: 10.28945/5776.</w:t>
       </w:r>
     </w:p>
     <w:p>
@@ -38127,14 +38033,7 @@
           <w:sz w:val="19"/>
           <w:szCs w:val="19"/>
         </w:rPr>
-        <w:t xml:space="preserve">[21]	</w:t>
-      </w:r>
-      <w:r>
-        <w:rPr>
-          <w:sz w:val="19"/>
-          <w:szCs w:val="19"/>
-        </w:rPr>
-        <w:t xml:space="preserve">S. Caton y C. Haas, “Fairness in machine learning: A survey,” ACM Computing Surveys, vol. 56, no. 7, pp. 1–38, 2024, doi: 10.1145/3616865.</w:t>
+        <w:t xml:space="preserve">[21]	S. Caton y C. Haas, “Fairness in machine learning: A survey,” ACM Computing Surveys, vol. 56, no. 7, pp. 1–38, 2024, doi: 10.1145/3616865.</w:t>
       </w:r>
     </w:p>
     <w:p>
@@ -38147,14 +38046,7 @@
           <w:sz w:val="19"/>
           <w:szCs w:val="19"/>
         </w:rPr>
-        <w:t xml:space="preserve">[22]	</w:t>
-      </w:r>
-      <w:r>
-        <w:rPr>
-          <w:sz w:val="19"/>
-          <w:szCs w:val="19"/>
-        </w:rPr>
-        <w:t xml:space="preserve">E. Mosqueira-Rey et al., “Human-in-the-loop machine learning: A state of the art,” Artificial Intelligence Review, vol. 56, 2023, doi: 10.1007/s10462-022-10246-w.</w:t>
+        <w:t xml:space="preserve">[22]	E. Mosqueira-Rey et al., “Human-in-the-loop machine learning: A state of the art,” Artificial Intelligence Review, vol. 56, 2023, doi: 10.1007/s10462-022-10246-w.</w:t>
       </w:r>
     </w:p>
     <w:p>
@@ -38167,14 +38059,7 @@
           <w:sz w:val="19"/>
           <w:szCs w:val="19"/>
         </w:rPr>
-        <w:t xml:space="preserve">[23]	</w:t>
-      </w:r>
-      <w:r>
-        <w:rPr>
-          <w:sz w:val="19"/>
-          <w:szCs w:val="19"/>
-        </w:rPr>
-        <w:t xml:space="preserve">K. Schwaber y J. Sutherland, La Guía Scrum, nov. 2020.</w:t>
+        <w:t xml:space="preserve">[23]	K. Schwaber y J. Sutherland, La Guía Scrum, nov. 2020.</w:t>
       </w:r>
     </w:p>
     <w:p>
@@ -38187,14 +38072,7 @@
           <w:sz w:val="19"/>
           <w:szCs w:val="19"/>
         </w:rPr>
-        <w:t xml:space="preserve">[24]	</w:t>
-      </w:r>
-      <w:r>
-        <w:rPr>
-          <w:sz w:val="19"/>
-          <w:szCs w:val="19"/>
-        </w:rPr>
-        <w:t xml:space="preserve">República del Ecuador, Ley Orgánica de Protección de Datos Personales, Quinto Suplemento del Registro Oficial No. 459, 26 de mayo de 2021.</w:t>
+        <w:t xml:space="preserve">[24]	República del Ecuador, Ley Orgánica de Protección de Datos Personales, Quinto Suplemento del Registro Oficial No. 459, 26 de mayo de 2021.</w:t>
       </w:r>
     </w:p>
     <w:p>
@@ -38207,14 +38085,7 @@
           <w:sz w:val="19"/>
           <w:szCs w:val="19"/>
         </w:rPr>
-        <w:t xml:space="preserve">[25]	</w:t>
-      </w:r>
-      <w:r>
-        <w:rPr>
-          <w:sz w:val="19"/>
-          <w:szCs w:val="19"/>
-        </w:rPr>
-        <w:t xml:space="preserve">Scikit-learn, “Common pitfalls and recommended practices: Data leakage.” [En línea]. Disponible: https://scikit-learn.org/stable/common_pitfalls.html</w:t>
+        <w:t xml:space="preserve">[25]	Scikit-learn, “Common pitfalls and recommended practices: Data leakage.” [En línea]. Disponible: https://scikit-learn.org/stable/common_pitfalls.html</w:t>
       </w:r>
     </w:p>
     <w:p>
@@ -38227,14 +38098,7 @@
           <w:sz w:val="19"/>
           <w:szCs w:val="19"/>
         </w:rPr>
-        <w:t xml:space="preserve">[26]	</w:t>
-      </w:r>
-      <w:r>
-        <w:rPr>
-          <w:sz w:val="19"/>
-          <w:szCs w:val="19"/>
-        </w:rPr>
-        <w:t xml:space="preserve">Scikit-learn, “Cross-validation: Evaluating estimator performance.” [En línea]. Disponible: https://scikit-learn.org/stable/modules/cross_validation.html</w:t>
+        <w:t xml:space="preserve">[26]	Scikit-learn, “Cross-validation: Evaluating estimator performance.” [En línea]. Disponible: https://scikit-learn.org/stable/modules/cross_validation.html</w:t>
       </w:r>
     </w:p>
     <w:p>
@@ -38247,14 +38111,7 @@
           <w:sz w:val="19"/>
           <w:szCs w:val="19"/>
         </w:rPr>
-        <w:t xml:space="preserve">[27]	</w:t>
-      </w:r>
-      <w:r>
-        <w:rPr>
-          <w:sz w:val="19"/>
-          <w:szCs w:val="19"/>
-        </w:rPr>
-        <w:t xml:space="preserve">C. D. Manning, P. Raghavan y H. Schütze, Introduction to Information Retrieval. Cambridge Univ. Press, 2008, cap. 8.</w:t>
+        <w:t xml:space="preserve">[27]	C. D. Manning, P. Raghavan y H. Schütze, Introduction to Information Retrieval. Cambridge Univ. Press, 2008, cap. 8.</w:t>
       </w:r>
     </w:p>
     <w:p>
@@ -38267,14 +38124,7 @@
           <w:sz w:val="19"/>
           <w:szCs w:val="19"/>
         </w:rPr>
-        <w:t xml:space="preserve">[28]	</w:t>
-      </w:r>
-      <w:r>
-        <w:rPr>
-          <w:sz w:val="19"/>
-          <w:szCs w:val="19"/>
-        </w:rPr>
-        <w:t xml:space="preserve">Superintendencia de Protección de Datos Personales del Ecuador, Resolución SPDP-SPD-2025-0030-R, Reglamento para la seudonimización, anonimización, bloqueo y eliminación de datos personales, 7 de agosto de 2025.</w:t>
+        <w:t xml:space="preserve">[28]	Superintendencia de Protección de Datos Personales del Ecuador, Resolución SPDP-SPD-2025-0030-R, Reglamento para la seudonimización, anonimización, bloqueo y eliminación de datos personales, 7 de agosto de 2025.</w:t>
       </w:r>
     </w:p>
     <w:p>
@@ -38287,14 +38137,7 @@
           <w:sz w:val="19"/>
           <w:szCs w:val="19"/>
         </w:rPr>
-        <w:t xml:space="preserve">[29]	</w:t>
-      </w:r>
-      <w:r>
-        <w:rPr>
-          <w:sz w:val="19"/>
-          <w:szCs w:val="19"/>
-        </w:rPr>
-        <w:t xml:space="preserve">T. Akiba, S. Sano, T. Yanase, T. Ohta y M. Koyama, “Optuna: A next-generation hyperparameter optimization framework,” en Proc. 25th ACM SIGKDD, 2019, pp. 2623–2631, doi: 10.1145/3292500.3330701.</w:t>
+        <w:t xml:space="preserve">[29]	T. Akiba, S. Sano, T. Yanase, T. Ohta y M. Koyama, “Optuna: A next-generation hyperparameter optimization framework,” en Proc. 25th ACM SIGKDD, 2019, pp. 2623–2631, doi: 10.1145/3292500.3330701.</w:t>
       </w:r>
     </w:p>
     <w:p>
@@ -38307,14 +38150,7 @@
           <w:sz w:val="19"/>
           <w:szCs w:val="19"/>
         </w:rPr>
-        <w:t xml:space="preserve">[30]	</w:t>
-      </w:r>
-      <w:r>
-        <w:rPr>
-          <w:sz w:val="19"/>
-          <w:szCs w:val="19"/>
-        </w:rPr>
-        <w:t xml:space="preserve">F. Pedregosa et al., “Scikit-learn: Machine learning in Python,” J. Mach. Learn. Res., vol. 12, pp. 2825–2830, 2011.</w:t>
+        <w:t xml:space="preserve">[30]	F. Pedregosa et al., “Scikit-learn: Machine learning in Python,” J. Mach. Learn. Res., vol. 12, pp. 2825–2830, 2011.</w:t>
       </w:r>
     </w:p>
     <w:p>
@@ -38327,14 +38163,7 @@
           <w:sz w:val="19"/>
           <w:szCs w:val="19"/>
         </w:rPr>
-        <w:t xml:space="preserve">[31]	</w:t>
-      </w:r>
-      <w:r>
-        <w:rPr>
-          <w:sz w:val="19"/>
-          <w:szCs w:val="19"/>
-        </w:rPr>
-        <w:t xml:space="preserve">S. M. Lundberg y S.-I. Lee, “A unified approach to interpreting model predictions,” en Advances in Neural Information Processing Systems 30, 2017, pp. 4765–4774.</w:t>
+        <w:t xml:space="preserve">[31]	S. M. Lundberg y S.-I. Lee, “A unified approach to interpreting model predictions,” en Advances in Neural Information Processing Systems 30, 2017, pp. 4765–4774.</w:t>
       </w:r>
     </w:p>
     <w:p>
@@ -38347,14 +38176,7 @@
           <w:sz w:val="19"/>
           <w:szCs w:val="19"/>
         </w:rPr>
-        <w:t xml:space="preserve">[32]	</w:t>
-      </w:r>
-      <w:r>
-        <w:rPr>
-          <w:sz w:val="19"/>
-          <w:szCs w:val="19"/>
-        </w:rPr>
-        <w:t xml:space="preserve">J. Platt, “Probabilistic outputs for support vector machines and comparisons to regularized likelihood methods,” en Advances in Large Margin Classifiers, MIT Press, 1999, pp. 61–74.</w:t>
+        <w:t xml:space="preserve">[32]	J. Platt, “Probabilistic outputs for support vector machines and comparisons to regularized likelihood methods,” en Advances in Large Margin Classifiers, MIT Press, 1999, pp. 61–74.</w:t>
       </w:r>
     </w:p>
     <w:p>
@@ -38367,14 +38189,7 @@
           <w:sz w:val="19"/>
           <w:szCs w:val="19"/>
         </w:rPr>
-        <w:t xml:space="preserve">[33]	</w:t>
-      </w:r>
-      <w:r>
-        <w:rPr>
-          <w:sz w:val="19"/>
-          <w:szCs w:val="19"/>
-        </w:rPr>
-        <w:t xml:space="preserve">M. Mitchell et al., “Model cards for model reporting,” en Proc. Conf. Fairness, Accountability, and Transparency (FAT*), 2019, pp. 220–229, doi: 10.1145/3287560.3287596.</w:t>
+        <w:t xml:space="preserve">[33]	M. Mitchell et al., “Model cards for model reporting,” en Proc. Conf. Fairness, Accountability, and Transparency (FAT*), 2019, pp. 220–229, doi: 10.1145/3287560.3287596.</w:t>
       </w:r>
     </w:p>
     <w:p>
@@ -38387,14 +38202,7 @@
           <w:sz w:val="19"/>
           <w:szCs w:val="19"/>
         </w:rPr>
-        <w:t xml:space="preserve">[34]	</w:t>
-      </w:r>
-      <w:r>
-        <w:rPr>
-          <w:sz w:val="19"/>
-          <w:szCs w:val="19"/>
-        </w:rPr>
-        <w:t xml:space="preserve">H. Weerts, M. Dudík, R. Edgar, A. Jalali, R. Lutz y M. Madaio, “Fairlearn: Assessing and improving fairness of AI systems,” J. Mach. Learn. Res., vol. 24, no. 257, pp. 1–8, 2023.</w:t>
+        <w:t xml:space="preserve">[34]	H. Weerts, M. Dudík, R. Edgar, A. Jalali, R. Lutz y M. Madaio, “Fairlearn: Assessing and improving fairness of AI systems,” J. Mach. Learn. Res., vol. 24, no. 257, pp. 1–8, 2023.</w:t>
       </w:r>
     </w:p>
     <w:p>
@@ -38407,14 +38215,7 @@
           <w:sz w:val="19"/>
           <w:szCs w:val="19"/>
         </w:rPr>
-        <w:t xml:space="preserve">[35]	</w:t>
-      </w:r>
-      <w:r>
-        <w:rPr>
-          <w:sz w:val="19"/>
-          <w:szCs w:val="19"/>
-        </w:rPr>
-        <w:t xml:space="preserve">B. Efron y R. J. Tibshirani, An Introduction to the Bootstrap. Chapman &amp; Hall/CRC, 1994.</w:t>
+        <w:t xml:space="preserve">[35]	B. Efron y R. J. Tibshirani, An Introduction to the Bootstrap. Chapman &amp; Hall/CRC, 1994.</w:t>
       </w:r>
     </w:p>
     <w:p>
@@ -38427,14 +38228,7 @@
           <w:sz w:val="19"/>
           <w:szCs w:val="19"/>
         </w:rPr>
-        <w:t xml:space="preserve">[36]	</w:t>
-      </w:r>
-      <w:r>
-        <w:rPr>
-          <w:sz w:val="19"/>
-          <w:szCs w:val="19"/>
-        </w:rPr>
-        <w:t xml:space="preserve">Superintendencia de Protección de Datos Personales del Ecuador, Resolución SPDP-SPD-2026-0009-R, Norma general para la garantía del derecho de protección de datos personales en el uso de sistemas de inteligencia artificial, 12 de febrero de 2026.</w:t>
+        <w:t xml:space="preserve">[36]	Superintendencia de Protección de Datos Personales del Ecuador, Resolución SPDP-SPD-2026-0009-R, Norma general para la garantía del derecho de protección de datos personales en el uso de sistemas de inteligencia artificial, 12 de febrero de 2026.</w:t>
       </w:r>
     </w:p>
     <w:p>
@@ -38447,14 +38241,7 @@
           <w:sz w:val="19"/>
           <w:szCs w:val="19"/>
         </w:rPr>
-        <w:t xml:space="preserve">[37]	</w:t>
-      </w:r>
-      <w:r>
-        <w:rPr>
-          <w:sz w:val="19"/>
-          <w:szCs w:val="19"/>
-        </w:rPr>
-        <w:t xml:space="preserve">UNESCO, Recomendación sobre la ética de la inteligencia artificial, 2021.</w:t>
+        <w:t xml:space="preserve">[37]	UNESCO, Recomendación sobre la ética de la inteligencia artificial, 2021.</w:t>
       </w:r>
     </w:p>
     <w:p>
@@ -38467,14 +38254,7 @@
           <w:sz w:val="19"/>
           <w:szCs w:val="19"/>
         </w:rPr>
-        <w:t xml:space="preserve">[38]	</w:t>
-      </w:r>
-      <w:r>
-        <w:rPr>
-          <w:sz w:val="19"/>
-          <w:szCs w:val="19"/>
-        </w:rPr>
-        <w:t xml:space="preserve">National Institute of Standards and Technology, Artificial Intelligence Risk Management Framework (AI RMF 1.0), NIST AI 100-1, 2023, doi: 10.6028/NIST.AI.100-1.</w:t>
+        <w:t xml:space="preserve">[38]	National Institute of Standards and Technology, Artificial Intelligence Risk Management Framework (AI RMF 1.0), NIST AI 100-1, 2023, doi: 10.6028/NIST.AI.100-1.</w:t>
       </w:r>
     </w:p>
     <w:p>
@@ -38487,14 +38267,7 @@
           <w:sz w:val="19"/>
           <w:szCs w:val="19"/>
         </w:rPr>
-        <w:t xml:space="preserve">[39]	</w:t>
-      </w:r>
-      <w:r>
-        <w:rPr>
-          <w:sz w:val="19"/>
-          <w:szCs w:val="19"/>
-        </w:rPr>
-        <w:t xml:space="preserve">J. C. Perdomo, T. Britton, M. Hardt y R. Abebe, “Difficult lessons on social prediction from Wisconsin public schools,” en Proc. ACM Conf. Fairness, Accountability, and Transparency (FAccT), 2025, doi: 10.1145/3715275.3732175.</w:t>
+        <w:t xml:space="preserve">[39]	J. C. Perdomo, T. Britton, M. Hardt y R. Abebe, “Difficult lessons on social prediction from Wisconsin public schools,” en Proc. ACM Conf. Fairness, Accountability, and Transparency (FAccT), 2025, doi: 10.1145/3715275.3732175.</w:t>
       </w:r>
     </w:p>
     <w:p>

</xml_diff>